<commit_message>
Actualizar evidencias y presentacion Fase 1
</commit_message>
<xml_diff>
--- a/Fase 1/Evidencias Individuales/Velasquez_Ariel_1.1_APT122_AutoevaluacionCompetenciasFase1.docx
+++ b/Fase 1/Evidencias Individuales/Velasquez_Ariel_1.1_APT122_AutoevaluacionCompetenciasFase1.docx
@@ -435,7 +435,6 @@
             <w:pPr>
               <w:keepNext w:val="0"/>
               <w:keepLines w:val="0"/>
-              <w:pageBreakBefore w:val="0"/>
               <w:widowControl w:val="1"/>
               <w:pBdr>
                 <w:top w:space="0" w:sz="0" w:val="nil"/>
@@ -530,7 +529,6 @@
             <w:pPr>
               <w:keepNext w:val="0"/>
               <w:keepLines w:val="0"/>
-              <w:pageBreakBefore w:val="0"/>
               <w:widowControl w:val="1"/>
               <w:pBdr>
                 <w:top w:space="0" w:sz="0" w:val="nil"/>
@@ -625,7 +623,6 @@
             <w:pPr>
               <w:keepNext w:val="0"/>
               <w:keepLines w:val="0"/>
-              <w:pageBreakBefore w:val="0"/>
               <w:widowControl w:val="1"/>
               <w:pBdr>
                 <w:top w:space="0" w:sz="0" w:val="nil"/>
@@ -719,7 +716,6 @@
             <w:pPr>
               <w:keepNext w:val="0"/>
               <w:keepLines w:val="0"/>
-              <w:pageBreakBefore w:val="0"/>
               <w:widowControl w:val="1"/>
               <w:pBdr>
                 <w:top w:space="0" w:sz="0" w:val="nil"/>
@@ -814,7 +810,6 @@
             <w:pPr>
               <w:keepNext w:val="0"/>
               <w:keepLines w:val="0"/>
-              <w:pageBreakBefore w:val="0"/>
               <w:widowControl w:val="1"/>
               <w:pBdr>
                 <w:top w:space="0" w:sz="0" w:val="nil"/>
@@ -875,7 +870,6 @@
             <w:pPr>
               <w:keepNext w:val="0"/>
               <w:keepLines w:val="0"/>
-              <w:pageBreakBefore w:val="0"/>
               <w:widowControl w:val="1"/>
               <w:pBdr>
                 <w:top w:space="0" w:sz="0" w:val="nil"/>
@@ -1539,7 +1533,6 @@
             <w:pPr>
               <w:keepNext w:val="0"/>
               <w:keepLines w:val="0"/>
-              <w:pageBreakBefore w:val="0"/>
               <w:widowControl w:val="1"/>
               <w:pBdr>
                 <w:top w:space="0" w:sz="0" w:val="nil"/>
@@ -1606,7 +1599,6 @@
             <w:pPr>
               <w:keepNext w:val="0"/>
               <w:keepLines w:val="0"/>
-              <w:pageBreakBefore w:val="0"/>
               <w:widowControl w:val="1"/>
               <w:pBdr>
                 <w:top w:space="0" w:sz="0" w:val="nil"/>
@@ -1667,7 +1659,6 @@
             <w:pPr>
               <w:keepNext w:val="0"/>
               <w:keepLines w:val="0"/>
-              <w:pageBreakBefore w:val="0"/>
               <w:widowControl w:val="1"/>
               <w:pBdr>
                 <w:top w:space="0" w:sz="0" w:val="nil"/>
@@ -1703,7 +1694,7 @@
                 <w:szCs w:val="24"/>
                 <w:rtl w:val="0"/>
               </w:rPr>
-              <w:t xml:space="preserve">Ignacio Daniel José Ruiz Mancilla</w:t>
+              <w:t xml:space="preserve">Ariel Marcelo Velasquez Chamia</w:t>
             </w:r>
             <w:r>
               <w:rPr>
@@ -1724,7 +1715,6 @@
             <w:pPr>
               <w:keepNext w:val="0"/>
               <w:keepLines w:val="0"/>
-              <w:pageBreakBefore w:val="0"/>
               <w:widowControl w:val="1"/>
               <w:pBdr>
                 <w:top w:space="0" w:sz="0" w:val="nil"/>
@@ -1785,7 +1775,6 @@
             <w:pPr>
               <w:keepNext w:val="0"/>
               <w:keepLines w:val="0"/>
-              <w:pageBreakBefore w:val="0"/>
               <w:widowControl w:val="1"/>
               <w:pBdr>
                 <w:top w:space="0" w:sz="0" w:val="nil"/>
@@ -1833,7 +1822,6 @@
             <w:pPr>
               <w:keepNext w:val="0"/>
               <w:keepLines w:val="0"/>
-              <w:pageBreakBefore w:val="0"/>
               <w:widowControl w:val="1"/>
               <w:pBdr>
                 <w:top w:space="0" w:sz="0" w:val="nil"/>
@@ -1894,7 +1882,6 @@
             <w:pPr>
               <w:keepNext w:val="0"/>
               <w:keepLines w:val="0"/>
-              <w:pageBreakBefore w:val="0"/>
               <w:widowControl w:val="1"/>
               <w:pBdr>
                 <w:top w:space="0" w:sz="0" w:val="nil"/>
@@ -2406,53 +2393,62 @@
               <w:rPr>
                 <w:b w:val="1"/>
                 <w:bCs w:val="1"/>
-                <w:color w:val="ff0000"/>
-                <w:sz w:val="18"/>
-                <w:szCs w:val="18"/>
-              </w:rPr>
-            </w:pPr>
-            <w:r>
-              <w:rPr>
-                <w:rtl w:val="0"/>
-              </w:rPr>
-            </w:r>
-          </w:p>
-        </w:tc>
-        <w:tc>
-          <w:tcPr/>
-          <w:p>
-            <w:pPr>
-              <w:jc w:val="center"/>
-              <w:rPr>
-                <w:b w:val="1"/>
-                <w:bCs w:val="1"/>
-                <w:sz w:val="18"/>
-                <w:szCs w:val="18"/>
-              </w:rPr>
-            </w:pPr>
-            <w:r>
-              <w:rPr>
-                <w:rtl w:val="0"/>
-              </w:rPr>
-            </w:r>
-          </w:p>
-        </w:tc>
-        <w:tc>
-          <w:tcPr/>
-          <w:p>
-            <w:pPr>
-              <w:jc w:val="center"/>
-              <w:rPr>
-                <w:b w:val="1"/>
-                <w:bCs w:val="1"/>
-                <w:sz w:val="18"/>
-                <w:szCs w:val="18"/>
-              </w:rPr>
-            </w:pPr>
-            <w:r>
-              <w:rPr>
-                <w:rtl w:val="0"/>
-              </w:rPr>
+                <w:sz w:val="18"/>
+                <w:szCs w:val="18"/>
+              </w:rPr>
+            </w:pPr>
+            <w:r>
+              <w:rPr>
+                <w:b w:val="1"/>
+                <w:bCs w:val="1"/>
+                <w:sz w:val="18"/>
+                <w:szCs w:val="18"/>
+                <w:rtl w:val="0"/>
+              </w:rPr>
+              <w:t xml:space="preserve">Desarrollo de Software Web y Móvil (Desarrollo de aplicaciones e interfaces web) </w:t>
+            </w:r>
+          </w:p>
+        </w:tc>
+        <w:tc>
+          <w:tcPr/>
+          <w:p>
+            <w:pPr>
+              <w:jc w:val="center"/>
+              <w:rPr>
+                <w:b w:val="1"/>
+                <w:bCs w:val="1"/>
+                <w:sz w:val="18"/>
+                <w:szCs w:val="18"/>
+              </w:rPr>
+            </w:pPr>
+            <w:r>
+              <w:rPr>
+                <w:rtl w:val="0"/>
+              </w:rPr>
+            </w:r>
+          </w:p>
+        </w:tc>
+        <w:tc>
+          <w:tcPr/>
+          <w:p>
+            <w:pPr>
+              <w:jc w:val="center"/>
+              <w:rPr>
+                <w:b w:val="1"/>
+                <w:bCs w:val="1"/>
+                <w:sz w:val="18"/>
+                <w:szCs w:val="18"/>
+              </w:rPr>
+            </w:pPr>
+            <w:r>
+              <w:rPr>
+                <w:b w:val="1"/>
+                <w:bCs w:val="1"/>
+                <w:sz w:val="18"/>
+                <w:szCs w:val="18"/>
+                <w:rtl w:val="0"/>
+              </w:rPr>
+              <w:t xml:space="preserve">X</w:t>
             </w:r>
           </w:p>
         </w:tc>
@@ -2547,53 +2543,62 @@
               <w:rPr>
                 <w:b w:val="1"/>
                 <w:bCs w:val="1"/>
-                <w:color w:val="ff0000"/>
-                <w:sz w:val="18"/>
-                <w:szCs w:val="18"/>
-              </w:rPr>
-            </w:pPr>
-            <w:r>
-              <w:rPr>
-                <w:rtl w:val="0"/>
-              </w:rPr>
-            </w:r>
-          </w:p>
-        </w:tc>
-        <w:tc>
-          <w:tcPr/>
-          <w:p>
-            <w:pPr>
-              <w:jc w:val="center"/>
-              <w:rPr>
-                <w:b w:val="1"/>
-                <w:bCs w:val="1"/>
-                <w:sz w:val="18"/>
-                <w:szCs w:val="18"/>
-              </w:rPr>
-            </w:pPr>
-            <w:r>
-              <w:rPr>
-                <w:rtl w:val="0"/>
-              </w:rPr>
-            </w:r>
-          </w:p>
-        </w:tc>
-        <w:tc>
-          <w:tcPr/>
-          <w:p>
-            <w:pPr>
-              <w:jc w:val="center"/>
-              <w:rPr>
-                <w:b w:val="1"/>
-                <w:bCs w:val="1"/>
-                <w:sz w:val="18"/>
-                <w:szCs w:val="18"/>
-              </w:rPr>
-            </w:pPr>
-            <w:r>
-              <w:rPr>
-                <w:rtl w:val="0"/>
-              </w:rPr>
+                <w:sz w:val="18"/>
+                <w:szCs w:val="18"/>
+              </w:rPr>
+            </w:pPr>
+            <w:r>
+              <w:rPr>
+                <w:b w:val="1"/>
+                <w:bCs w:val="1"/>
+                <w:sz w:val="18"/>
+                <w:szCs w:val="18"/>
+                <w:rtl w:val="0"/>
+              </w:rPr>
+              <w:t xml:space="preserve">Modelamiento y Gestión de Bases de Datos (Diseño, consultas y manejo de información) </w:t>
+            </w:r>
+          </w:p>
+        </w:tc>
+        <w:tc>
+          <w:tcPr/>
+          <w:p>
+            <w:pPr>
+              <w:jc w:val="center"/>
+              <w:rPr>
+                <w:b w:val="1"/>
+                <w:bCs w:val="1"/>
+                <w:sz w:val="18"/>
+                <w:szCs w:val="18"/>
+              </w:rPr>
+            </w:pPr>
+            <w:r>
+              <w:rPr>
+                <w:rtl w:val="0"/>
+              </w:rPr>
+            </w:r>
+          </w:p>
+        </w:tc>
+        <w:tc>
+          <w:tcPr/>
+          <w:p>
+            <w:pPr>
+              <w:jc w:val="center"/>
+              <w:rPr>
+                <w:b w:val="1"/>
+                <w:bCs w:val="1"/>
+                <w:sz w:val="18"/>
+                <w:szCs w:val="18"/>
+              </w:rPr>
+            </w:pPr>
+            <w:r>
+              <w:rPr>
+                <w:b w:val="1"/>
+                <w:bCs w:val="1"/>
+                <w:sz w:val="18"/>
+                <w:szCs w:val="18"/>
+                <w:rtl w:val="0"/>
+              </w:rPr>
+              <w:t xml:space="preserve">X</w:t>
             </w:r>
           </w:p>
         </w:tc>
@@ -2694,27 +2699,37 @@
             </w:pPr>
             <w:r>
               <w:rPr>
-                <w:rtl w:val="0"/>
-              </w:rPr>
-            </w:r>
-          </w:p>
-        </w:tc>
-        <w:tc>
-          <w:tcPr/>
-          <w:p>
-            <w:pPr>
-              <w:jc w:val="center"/>
-              <w:rPr>
-                <w:b w:val="1"/>
-                <w:bCs w:val="1"/>
-                <w:sz w:val="18"/>
-                <w:szCs w:val="18"/>
-              </w:rPr>
-            </w:pPr>
-            <w:r>
-              <w:rPr>
-                <w:rtl w:val="0"/>
-              </w:rPr>
+                <w:b w:val="1"/>
+                <w:bCs w:val="1"/>
+                <w:sz w:val="18"/>
+                <w:szCs w:val="18"/>
+                <w:rtl w:val="0"/>
+              </w:rPr>
+              <w:t xml:space="preserve">Integración de Tecnologías e Inteligencia Artificial (Machine Learning, Deep Learning y OCR) </w:t>
+            </w:r>
+          </w:p>
+        </w:tc>
+        <w:tc>
+          <w:tcPr/>
+          <w:p>
+            <w:pPr>
+              <w:jc w:val="center"/>
+              <w:rPr>
+                <w:b w:val="1"/>
+                <w:bCs w:val="1"/>
+                <w:sz w:val="18"/>
+                <w:szCs w:val="18"/>
+              </w:rPr>
+            </w:pPr>
+            <w:r>
+              <w:rPr>
+                <w:b w:val="1"/>
+                <w:bCs w:val="1"/>
+                <w:sz w:val="18"/>
+                <w:szCs w:val="18"/>
+                <w:rtl w:val="0"/>
+              </w:rPr>
+              <w:t xml:space="preserve">X</w:t>
             </w:r>
           </w:p>
         </w:tc>
@@ -2834,65 +2849,375 @@
             </w:pPr>
             <w:r>
               <w:rPr>
-                <w:rtl w:val="0"/>
-              </w:rPr>
-            </w:r>
-          </w:p>
-        </w:tc>
-        <w:tc>
-          <w:tcPr/>
-          <w:p>
-            <w:pPr>
-              <w:jc w:val="center"/>
-              <w:rPr>
-                <w:b w:val="1"/>
-                <w:bCs w:val="1"/>
-                <w:sz w:val="18"/>
-                <w:szCs w:val="18"/>
-              </w:rPr>
-            </w:pPr>
-            <w:r>
-              <w:rPr>
-                <w:rtl w:val="0"/>
-              </w:rPr>
-            </w:r>
-          </w:p>
-        </w:tc>
-        <w:tc>
-          <w:tcPr/>
-          <w:p>
-            <w:pPr>
-              <w:jc w:val="center"/>
-              <w:rPr>
-                <w:b w:val="1"/>
-                <w:bCs w:val="1"/>
-                <w:sz w:val="18"/>
-                <w:szCs w:val="18"/>
-              </w:rPr>
-            </w:pPr>
-            <w:r>
-              <w:rPr>
-                <w:rtl w:val="0"/>
-              </w:rPr>
-            </w:r>
-          </w:p>
-        </w:tc>
-        <w:tc>
-          <w:tcPr/>
-          <w:p>
-            <w:pPr>
-              <w:jc w:val="center"/>
-              <w:rPr>
-                <w:b w:val="1"/>
-                <w:bCs w:val="1"/>
-                <w:sz w:val="18"/>
-                <w:szCs w:val="18"/>
-              </w:rPr>
-            </w:pPr>
-            <w:r>
-              <w:rPr>
-                <w:rtl w:val="0"/>
-              </w:rPr>
+                <w:b w:val="1"/>
+                <w:bCs w:val="1"/>
+                <w:sz w:val="18"/>
+                <w:szCs w:val="18"/>
+                <w:rtl w:val="0"/>
+              </w:rPr>
+              <w:t xml:space="preserve">Seguridad en Sistemas Computacionales (Protección de información y buenas prácticas) </w:t>
+            </w:r>
+          </w:p>
+        </w:tc>
+        <w:tc>
+          <w:tcPr/>
+          <w:p>
+            <w:pPr>
+              <w:jc w:val="center"/>
+              <w:rPr>
+                <w:b w:val="1"/>
+                <w:bCs w:val="1"/>
+                <w:sz w:val="18"/>
+                <w:szCs w:val="18"/>
+              </w:rPr>
+            </w:pPr>
+            <w:r>
+              <w:rPr>
+                <w:rtl w:val="0"/>
+              </w:rPr>
+            </w:r>
+          </w:p>
+        </w:tc>
+        <w:tc>
+          <w:tcPr/>
+          <w:p>
+            <w:pPr>
+              <w:jc w:val="center"/>
+              <w:rPr>
+                <w:b w:val="1"/>
+                <w:bCs w:val="1"/>
+                <w:sz w:val="18"/>
+                <w:szCs w:val="18"/>
+              </w:rPr>
+            </w:pPr>
+            <w:r>
+              <w:rPr>
+                <w:b w:val="1"/>
+                <w:bCs w:val="1"/>
+                <w:sz w:val="18"/>
+                <w:szCs w:val="18"/>
+                <w:rtl w:val="0"/>
+              </w:rPr>
+              <w:t xml:space="preserve">X</w:t>
+            </w:r>
+          </w:p>
+        </w:tc>
+        <w:tc>
+          <w:tcPr/>
+          <w:p>
+            <w:pPr>
+              <w:jc w:val="center"/>
+              <w:rPr>
+                <w:b w:val="1"/>
+                <w:bCs w:val="1"/>
+                <w:sz w:val="18"/>
+                <w:szCs w:val="18"/>
+              </w:rPr>
+            </w:pPr>
+            <w:r>
+              <w:rPr>
+                <w:rtl w:val="0"/>
+              </w:rPr>
+            </w:r>
+          </w:p>
+        </w:tc>
+        <w:tc>
+          <w:tcPr/>
+          <w:p>
+            <w:pPr>
+              <w:jc w:val="center"/>
+              <w:rPr>
+                <w:b w:val="1"/>
+                <w:bCs w:val="1"/>
+                <w:sz w:val="18"/>
+                <w:szCs w:val="18"/>
+              </w:rPr>
+            </w:pPr>
+            <w:r>
+              <w:rPr>
+                <w:rtl w:val="0"/>
+              </w:rPr>
+            </w:r>
+          </w:p>
+        </w:tc>
+        <w:tc>
+          <w:tcPr/>
+          <w:p>
+            <w:pPr>
+              <w:jc w:val="center"/>
+              <w:rPr>
+                <w:b w:val="1"/>
+                <w:bCs w:val="1"/>
+                <w:sz w:val="18"/>
+                <w:szCs w:val="18"/>
+              </w:rPr>
+            </w:pPr>
+            <w:r>
+              <w:rPr>
+                <w:rtl w:val="0"/>
+              </w:rPr>
+            </w:r>
+          </w:p>
+        </w:tc>
+        <w:tc>
+          <w:tcPr/>
+          <w:p>
+            <w:pPr>
+              <w:jc w:val="center"/>
+              <w:rPr>
+                <w:b w:val="1"/>
+                <w:bCs w:val="1"/>
+                <w:sz w:val="18"/>
+                <w:szCs w:val="18"/>
+              </w:rPr>
+            </w:pPr>
+            <w:r>
+              <w:rPr>
+                <w:rtl w:val="0"/>
+              </w:rPr>
+            </w:r>
+          </w:p>
+        </w:tc>
+      </w:tr>
+      <w:tr>
+        <w:trPr>
+          <w:cantSplit w:val="0"/>
+          <w:trHeight w:val="540" w:hRule="atLeast"/>
+          <w:tblHeader w:val="0"/>
+        </w:trPr>
+        <w:tc>
+          <w:tcPr/>
+          <w:p>
+            <w:pPr>
+              <w:jc w:val="center"/>
+              <w:rPr>
+                <w:b w:val="1"/>
+                <w:bCs w:val="1"/>
+                <w:sz w:val="18"/>
+                <w:szCs w:val="18"/>
+              </w:rPr>
+            </w:pPr>
+            <w:r>
+              <w:rPr>
+                <w:b w:val="1"/>
+                <w:bCs w:val="1"/>
+                <w:sz w:val="18"/>
+                <w:szCs w:val="18"/>
+                <w:rtl w:val="0"/>
+              </w:rPr>
+              <w:t xml:space="preserve">Gestión de Proyectos Informáticos (Planificación y metodologías ágiles) </w:t>
+            </w:r>
+          </w:p>
+        </w:tc>
+        <w:tc>
+          <w:tcPr/>
+          <w:p>
+            <w:pPr>
+              <w:jc w:val="center"/>
+              <w:rPr>
+                <w:b w:val="1"/>
+                <w:bCs w:val="1"/>
+                <w:sz w:val="18"/>
+                <w:szCs w:val="18"/>
+              </w:rPr>
+            </w:pPr>
+            <w:r>
+              <w:rPr>
+                <w:rtl w:val="0"/>
+              </w:rPr>
+            </w:r>
+          </w:p>
+        </w:tc>
+        <w:tc>
+          <w:tcPr/>
+          <w:p>
+            <w:pPr>
+              <w:jc w:val="center"/>
+              <w:rPr>
+                <w:b w:val="1"/>
+                <w:bCs w:val="1"/>
+                <w:sz w:val="18"/>
+                <w:szCs w:val="18"/>
+              </w:rPr>
+            </w:pPr>
+            <w:r>
+              <w:rPr>
+                <w:b w:val="1"/>
+                <w:bCs w:val="1"/>
+                <w:sz w:val="18"/>
+                <w:szCs w:val="18"/>
+                <w:rtl w:val="0"/>
+              </w:rPr>
+              <w:t xml:space="preserve">X</w:t>
+            </w:r>
+          </w:p>
+        </w:tc>
+        <w:tc>
+          <w:tcPr/>
+          <w:p>
+            <w:pPr>
+              <w:jc w:val="center"/>
+              <w:rPr>
+                <w:b w:val="1"/>
+                <w:bCs w:val="1"/>
+                <w:sz w:val="18"/>
+                <w:szCs w:val="18"/>
+              </w:rPr>
+            </w:pPr>
+            <w:r>
+              <w:rPr>
+                <w:rtl w:val="0"/>
+              </w:rPr>
+            </w:r>
+          </w:p>
+        </w:tc>
+        <w:tc>
+          <w:tcPr/>
+          <w:p>
+            <w:pPr>
+              <w:jc w:val="center"/>
+              <w:rPr>
+                <w:b w:val="1"/>
+                <w:bCs w:val="1"/>
+                <w:sz w:val="18"/>
+                <w:szCs w:val="18"/>
+              </w:rPr>
+            </w:pPr>
+            <w:r>
+              <w:rPr>
+                <w:rtl w:val="0"/>
+              </w:rPr>
+            </w:r>
+          </w:p>
+        </w:tc>
+        <w:tc>
+          <w:tcPr/>
+          <w:p>
+            <w:pPr>
+              <w:jc w:val="center"/>
+              <w:rPr>
+                <w:b w:val="1"/>
+                <w:bCs w:val="1"/>
+                <w:sz w:val="18"/>
+                <w:szCs w:val="18"/>
+              </w:rPr>
+            </w:pPr>
+            <w:r>
+              <w:rPr>
+                <w:rtl w:val="0"/>
+              </w:rPr>
+            </w:r>
+          </w:p>
+        </w:tc>
+        <w:tc>
+          <w:tcPr/>
+          <w:p>
+            <w:pPr>
+              <w:jc w:val="center"/>
+              <w:rPr>
+                <w:b w:val="1"/>
+                <w:bCs w:val="1"/>
+                <w:sz w:val="18"/>
+                <w:szCs w:val="18"/>
+              </w:rPr>
+            </w:pPr>
+            <w:r>
+              <w:rPr>
+                <w:rtl w:val="0"/>
+              </w:rPr>
+            </w:r>
+          </w:p>
+        </w:tc>
+      </w:tr>
+      <w:tr>
+        <w:trPr>
+          <w:cantSplit w:val="0"/>
+          <w:trHeight w:val="576" w:hRule="atLeast"/>
+          <w:tblHeader w:val="0"/>
+        </w:trPr>
+        <w:tc>
+          <w:tcPr/>
+          <w:p>
+            <w:pPr>
+              <w:jc w:val="center"/>
+              <w:rPr>
+                <w:b w:val="1"/>
+                <w:bCs w:val="1"/>
+                <w:sz w:val="18"/>
+                <w:szCs w:val="18"/>
+              </w:rPr>
+            </w:pPr>
+            <w:r>
+              <w:rPr>
+                <w:b w:val="1"/>
+                <w:bCs w:val="1"/>
+                <w:sz w:val="18"/>
+                <w:szCs w:val="18"/>
+                <w:rtl w:val="0"/>
+              </w:rPr>
+              <w:t xml:space="preserve">Calidad de Software y Testing (Pruebas y corrección de errores) </w:t>
+            </w:r>
+          </w:p>
+        </w:tc>
+        <w:tc>
+          <w:tcPr/>
+          <w:p>
+            <w:pPr>
+              <w:jc w:val="center"/>
+              <w:rPr>
+                <w:b w:val="1"/>
+                <w:bCs w:val="1"/>
+                <w:sz w:val="18"/>
+                <w:szCs w:val="18"/>
+              </w:rPr>
+            </w:pPr>
+            <w:r>
+              <w:rPr>
+                <w:rtl w:val="0"/>
+              </w:rPr>
+            </w:r>
+          </w:p>
+        </w:tc>
+        <w:tc>
+          <w:tcPr/>
+          <w:p>
+            <w:pPr>
+              <w:jc w:val="center"/>
+              <w:rPr>
+                <w:b w:val="1"/>
+                <w:bCs w:val="1"/>
+                <w:sz w:val="18"/>
+                <w:szCs w:val="18"/>
+              </w:rPr>
+            </w:pPr>
+            <w:r>
+              <w:rPr>
+                <w:rtl w:val="0"/>
+              </w:rPr>
+            </w:r>
+          </w:p>
+        </w:tc>
+        <w:tc>
+          <w:tcPr/>
+          <w:p>
+            <w:pPr>
+              <w:jc w:val="center"/>
+              <w:rPr>
+                <w:b w:val="1"/>
+                <w:bCs w:val="1"/>
+                <w:sz w:val="18"/>
+                <w:szCs w:val="18"/>
+              </w:rPr>
+            </w:pPr>
+            <w:r>
+              <w:rPr>
+                <w:b w:val="1"/>
+                <w:bCs w:val="1"/>
+                <w:sz w:val="18"/>
+                <w:szCs w:val="18"/>
+                <w:rtl w:val="0"/>
+              </w:rPr>
+              <w:t xml:space="preserve">X</w:t>
             </w:r>
           </w:p>
         </w:tc>
@@ -2974,27 +3299,37 @@
             </w:pPr>
             <w:r>
               <w:rPr>
-                <w:rtl w:val="0"/>
-              </w:rPr>
-            </w:r>
-          </w:p>
-        </w:tc>
-        <w:tc>
-          <w:tcPr/>
-          <w:p>
-            <w:pPr>
-              <w:jc w:val="center"/>
-              <w:rPr>
-                <w:b w:val="1"/>
-                <w:bCs w:val="1"/>
-                <w:sz w:val="18"/>
-                <w:szCs w:val="18"/>
-              </w:rPr>
-            </w:pPr>
-            <w:r>
-              <w:rPr>
-                <w:rtl w:val="0"/>
-              </w:rPr>
+                <w:b w:val="1"/>
+                <w:bCs w:val="1"/>
+                <w:sz w:val="18"/>
+                <w:szCs w:val="18"/>
+                <w:rtl w:val="0"/>
+              </w:rPr>
+              <w:t xml:space="preserve">Análisis y Procesamiento de Datos (Análisis, preparación e interpretación de información) </w:t>
+            </w:r>
+          </w:p>
+        </w:tc>
+        <w:tc>
+          <w:tcPr/>
+          <w:p>
+            <w:pPr>
+              <w:jc w:val="center"/>
+              <w:rPr>
+                <w:b w:val="1"/>
+                <w:bCs w:val="1"/>
+                <w:sz w:val="18"/>
+                <w:szCs w:val="18"/>
+              </w:rPr>
+            </w:pPr>
+            <w:r>
+              <w:rPr>
+                <w:b w:val="1"/>
+                <w:bCs w:val="1"/>
+                <w:sz w:val="18"/>
+                <w:szCs w:val="18"/>
+                <w:rtl w:val="0"/>
+              </w:rPr>
+              <w:t xml:space="preserve">X</w:t>
             </w:r>
           </w:p>
         </w:tc>
@@ -3114,326 +3449,56 @@
             </w:pPr>
             <w:r>
               <w:rPr>
-                <w:rtl w:val="0"/>
-              </w:rPr>
-            </w:r>
-          </w:p>
-        </w:tc>
-        <w:tc>
-          <w:tcPr/>
-          <w:p>
-            <w:pPr>
-              <w:jc w:val="center"/>
-              <w:rPr>
-                <w:b w:val="1"/>
-                <w:bCs w:val="1"/>
-                <w:sz w:val="18"/>
-                <w:szCs w:val="18"/>
-              </w:rPr>
-            </w:pPr>
-            <w:r>
-              <w:rPr>
-                <w:rtl w:val="0"/>
-              </w:rPr>
-            </w:r>
-          </w:p>
-        </w:tc>
-        <w:tc>
-          <w:tcPr/>
-          <w:p>
-            <w:pPr>
-              <w:jc w:val="center"/>
-              <w:rPr>
-                <w:b w:val="1"/>
-                <w:bCs w:val="1"/>
-                <w:sz w:val="18"/>
-                <w:szCs w:val="18"/>
-              </w:rPr>
-            </w:pPr>
-            <w:r>
-              <w:rPr>
-                <w:rtl w:val="0"/>
-              </w:rPr>
-            </w:r>
-          </w:p>
-        </w:tc>
-        <w:tc>
-          <w:tcPr/>
-          <w:p>
-            <w:pPr>
-              <w:jc w:val="center"/>
-              <w:rPr>
-                <w:b w:val="1"/>
-                <w:bCs w:val="1"/>
-                <w:sz w:val="18"/>
-                <w:szCs w:val="18"/>
-              </w:rPr>
-            </w:pPr>
-            <w:r>
-              <w:rPr>
-                <w:rtl w:val="0"/>
-              </w:rPr>
-            </w:r>
-          </w:p>
-        </w:tc>
-        <w:tc>
-          <w:tcPr/>
-          <w:p>
-            <w:pPr>
-              <w:jc w:val="center"/>
-              <w:rPr>
-                <w:b w:val="1"/>
-                <w:bCs w:val="1"/>
-                <w:sz w:val="18"/>
-                <w:szCs w:val="18"/>
-              </w:rPr>
-            </w:pPr>
-            <w:r>
-              <w:rPr>
-                <w:rtl w:val="0"/>
-              </w:rPr>
-            </w:r>
-          </w:p>
-        </w:tc>
-        <w:tc>
-          <w:tcPr/>
-          <w:p>
-            <w:pPr>
-              <w:jc w:val="center"/>
-              <w:rPr>
-                <w:b w:val="1"/>
-                <w:bCs w:val="1"/>
-                <w:sz w:val="18"/>
-                <w:szCs w:val="18"/>
-              </w:rPr>
-            </w:pPr>
-            <w:r>
-              <w:rPr>
-                <w:rtl w:val="0"/>
-              </w:rPr>
-            </w:r>
-          </w:p>
-        </w:tc>
-        <w:tc>
-          <w:tcPr/>
-          <w:p>
-            <w:pPr>
-              <w:jc w:val="center"/>
-              <w:rPr>
-                <w:b w:val="1"/>
-                <w:bCs w:val="1"/>
-                <w:sz w:val="18"/>
-                <w:szCs w:val="18"/>
-              </w:rPr>
-            </w:pPr>
-            <w:r>
-              <w:rPr>
-                <w:rtl w:val="0"/>
-              </w:rPr>
-            </w:r>
-          </w:p>
-        </w:tc>
-      </w:tr>
-      <w:tr>
-        <w:trPr>
-          <w:cantSplit w:val="0"/>
-          <w:trHeight w:val="591" w:hRule="atLeast"/>
-          <w:tblHeader w:val="0"/>
-        </w:trPr>
-        <w:tc>
-          <w:tcPr/>
-          <w:p>
-            <w:pPr>
-              <w:jc w:val="center"/>
-              <w:rPr>
-                <w:b w:val="1"/>
-                <w:bCs w:val="1"/>
-                <w:sz w:val="18"/>
-                <w:szCs w:val="18"/>
-              </w:rPr>
-            </w:pPr>
-            <w:r>
-              <w:rPr>
-                <w:rtl w:val="0"/>
-              </w:rPr>
-            </w:r>
-          </w:p>
-        </w:tc>
-        <w:tc>
-          <w:tcPr/>
-          <w:p>
-            <w:pPr>
-              <w:jc w:val="center"/>
-              <w:rPr>
-                <w:b w:val="1"/>
-                <w:bCs w:val="1"/>
-                <w:sz w:val="18"/>
-                <w:szCs w:val="18"/>
-              </w:rPr>
-            </w:pPr>
-            <w:r>
-              <w:rPr>
-                <w:rtl w:val="0"/>
-              </w:rPr>
-            </w:r>
-          </w:p>
-        </w:tc>
-        <w:tc>
-          <w:tcPr/>
-          <w:p>
-            <w:pPr>
-              <w:jc w:val="center"/>
-              <w:rPr>
-                <w:b w:val="1"/>
-                <w:bCs w:val="1"/>
-                <w:sz w:val="18"/>
-                <w:szCs w:val="18"/>
-              </w:rPr>
-            </w:pPr>
-            <w:r>
-              <w:rPr>
-                <w:rtl w:val="0"/>
-              </w:rPr>
-            </w:r>
-          </w:p>
-        </w:tc>
-        <w:tc>
-          <w:tcPr/>
-          <w:p>
-            <w:pPr>
-              <w:jc w:val="center"/>
-              <w:rPr>
-                <w:b w:val="1"/>
-                <w:bCs w:val="1"/>
-                <w:sz w:val="18"/>
-                <w:szCs w:val="18"/>
-              </w:rPr>
-            </w:pPr>
-            <w:r>
-              <w:rPr>
-                <w:rtl w:val="0"/>
-              </w:rPr>
-            </w:r>
-          </w:p>
-        </w:tc>
-        <w:tc>
-          <w:tcPr/>
-          <w:p>
-            <w:pPr>
-              <w:jc w:val="center"/>
-              <w:rPr>
-                <w:b w:val="1"/>
-                <w:bCs w:val="1"/>
-                <w:sz w:val="18"/>
-                <w:szCs w:val="18"/>
-              </w:rPr>
-            </w:pPr>
-            <w:r>
-              <w:rPr>
-                <w:rtl w:val="0"/>
-              </w:rPr>
-            </w:r>
-          </w:p>
-        </w:tc>
-        <w:tc>
-          <w:tcPr/>
-          <w:p>
-            <w:pPr>
-              <w:jc w:val="center"/>
-              <w:rPr>
-                <w:b w:val="1"/>
-                <w:bCs w:val="1"/>
-                <w:sz w:val="18"/>
-                <w:szCs w:val="18"/>
-              </w:rPr>
-            </w:pPr>
-            <w:r>
-              <w:rPr>
-                <w:rtl w:val="0"/>
-              </w:rPr>
-            </w:r>
-          </w:p>
-        </w:tc>
-        <w:tc>
-          <w:tcPr/>
-          <w:p>
-            <w:pPr>
-              <w:jc w:val="center"/>
-              <w:rPr>
-                <w:b w:val="1"/>
-                <w:bCs w:val="1"/>
-                <w:sz w:val="18"/>
-                <w:szCs w:val="18"/>
-              </w:rPr>
-            </w:pPr>
-            <w:r>
-              <w:rPr>
-                <w:rtl w:val="0"/>
-              </w:rPr>
-            </w:r>
-          </w:p>
-        </w:tc>
-      </w:tr>
-      <w:tr>
-        <w:trPr>
-          <w:cantSplit w:val="0"/>
-          <w:trHeight w:val="576" w:hRule="atLeast"/>
-          <w:tblHeader w:val="0"/>
-        </w:trPr>
-        <w:tc>
-          <w:tcPr/>
-          <w:p>
-            <w:pPr>
-              <w:jc w:val="center"/>
-              <w:rPr>
-                <w:b w:val="1"/>
-                <w:bCs w:val="1"/>
-                <w:sz w:val="18"/>
-                <w:szCs w:val="18"/>
-              </w:rPr>
-            </w:pPr>
-            <w:r>
-              <w:rPr>
-                <w:rtl w:val="0"/>
-              </w:rPr>
-            </w:r>
-          </w:p>
-        </w:tc>
-        <w:tc>
-          <w:tcPr/>
-          <w:p>
-            <w:pPr>
-              <w:jc w:val="center"/>
-              <w:rPr>
-                <w:b w:val="1"/>
-                <w:bCs w:val="1"/>
-                <w:sz w:val="18"/>
-                <w:szCs w:val="18"/>
-              </w:rPr>
-            </w:pPr>
-            <w:r>
-              <w:rPr>
-                <w:rtl w:val="0"/>
-              </w:rPr>
-            </w:r>
-          </w:p>
-        </w:tc>
-        <w:tc>
-          <w:tcPr/>
-          <w:p>
-            <w:pPr>
-              <w:jc w:val="center"/>
-              <w:rPr>
-                <w:b w:val="1"/>
-                <w:bCs w:val="1"/>
-                <w:sz w:val="18"/>
-                <w:szCs w:val="18"/>
-              </w:rPr>
-            </w:pPr>
-            <w:r>
-              <w:rPr>
-                <w:rtl w:val="0"/>
-              </w:rPr>
+                <w:b w:val="1"/>
+                <w:bCs w:val="1"/>
+                <w:sz w:val="18"/>
+                <w:szCs w:val="18"/>
+                <w:rtl w:val="0"/>
+              </w:rPr>
+              <w:t xml:space="preserve">Big Data (Procesamiento y manejo de grandes volúmenes de información) </w:t>
+            </w:r>
+          </w:p>
+        </w:tc>
+        <w:tc>
+          <w:tcPr/>
+          <w:p>
+            <w:pPr>
+              <w:jc w:val="center"/>
+              <w:rPr>
+                <w:b w:val="1"/>
+                <w:bCs w:val="1"/>
+                <w:sz w:val="18"/>
+                <w:szCs w:val="18"/>
+              </w:rPr>
+            </w:pPr>
+            <w:r>
+              <w:rPr>
+                <w:rtl w:val="0"/>
+              </w:rPr>
+            </w:r>
+          </w:p>
+        </w:tc>
+        <w:tc>
+          <w:tcPr/>
+          <w:p>
+            <w:pPr>
+              <w:jc w:val="center"/>
+              <w:rPr>
+                <w:b w:val="1"/>
+                <w:bCs w:val="1"/>
+                <w:sz w:val="18"/>
+                <w:szCs w:val="18"/>
+              </w:rPr>
+            </w:pPr>
+            <w:r>
+              <w:rPr>
+                <w:b w:val="1"/>
+                <w:bCs w:val="1"/>
+                <w:sz w:val="18"/>
+                <w:szCs w:val="18"/>
+                <w:rtl w:val="0"/>
+              </w:rPr>
+              <w:t xml:space="preserve">X</w:t>
             </w:r>
           </w:p>
         </w:tc>
@@ -3588,55 +3653,6 @@
     <w:pPr>
       <w:keepNext w:val="0"/>
       <w:keepLines w:val="0"/>
-      <w:pageBreakBefore w:val="0"/>
-      <w:widowControl w:val="1"/>
-      <w:pBdr>
-        <w:top w:space="0" w:sz="0" w:val="nil"/>
-        <w:left w:space="0" w:sz="0" w:val="nil"/>
-        <w:bottom w:space="0" w:sz="0" w:val="nil"/>
-        <w:right w:space="0" w:sz="0" w:val="nil"/>
-        <w:between w:space="0" w:sz="0" w:val="nil"/>
-      </w:pBdr>
-      <w:shd w:fill="auto" w:val="clear"/>
-      <w:tabs>
-        <w:tab w:val="center" w:leader="none" w:pos="4419"/>
-        <w:tab w:val="right" w:leader="none" w:pos="8838"/>
-      </w:tabs>
-      <w:spacing w:after="0" w:before="0" w:line="240" w:lineRule="auto"/>
-      <w:ind w:left="0" w:right="0" w:firstLine="0"/>
-      <w:jc w:val="left"/>
-      <w:rPr>
-        <w:rFonts w:ascii="Calibri" w:cs="Calibri" w:eastAsia="Calibri" w:hAnsi="Calibri"/>
-        <w:b w:val="0"/>
-        <w:bCs w:val="0"/>
-        <w:i w:val="0"/>
-        <w:iCs w:val="0"/>
-        <w:smallCaps w:val="0"/>
-        <w:strike w:val="0"/>
-        <w:color w:val="000000"/>
-        <w:sz w:val="22"/>
-        <w:szCs w:val="22"/>
-        <w:u w:val="none"/>
-        <w:shd w:fill="auto" w:val="clear"/>
-        <w:vertAlign w:val="baseline"/>
-      </w:rPr>
-    </w:pPr>
-    <w:r>
-      <w:rPr>
-        <w:rtl w:val="0"/>
-      </w:rPr>
-    </w:r>
-  </w:p>
-</w:ftr>
-</file>
-
-<file path=word/footer2.xml><?xml version="1.0" encoding="utf-8"?>
-<w:ftr xmlns:mc="http://schemas.openxmlformats.org/markup-compatibility/2006" xmlns:o="urn:schemas-microsoft-com:office:office" xmlns:r="http://schemas.openxmlformats.org/officeDocument/2006/relationships" xmlns:m="http://schemas.openxmlformats.org/officeDocument/2006/math" xmlns:v="urn:schemas-microsoft-com:vml" xmlns:wp="http://schemas.openxmlformats.org/drawingml/2006/wordprocessingDrawing" xmlns:w10="urn:schemas-microsoft-com:office:word" xmlns:w="http://schemas.openxmlformats.org/wordprocessingml/2006/main" xmlns:wne="http://schemas.microsoft.com/office/word/2006/wordml" xmlns:sl="http://schemas.openxmlformats.org/schemaLibrary/2006/main" xmlns:a="http://schemas.openxmlformats.org/drawingml/2006/main" xmlns:pic="http://schemas.openxmlformats.org/drawingml/2006/picture" xmlns:c="http://schemas.openxmlformats.org/drawingml/2006/chart" xmlns:lc="http://schemas.openxmlformats.org/drawingml/2006/lockedCanvas" xmlns:dgm="http://schemas.openxmlformats.org/drawingml/2006/diagram" xmlns:wps="http://schemas.microsoft.com/office/word/2010/wordprocessingShape" xmlns:wpg="http://schemas.microsoft.com/office/word/2010/wordprocessingGroup" xmlns:w14="http://schemas.microsoft.com/office/word/2010/wordml" xmlns:w15="http://schemas.microsoft.com/office/word/2012/wordml" xmlns:w16="http://schemas.microsoft.com/office/word/2018/wordml" xmlns:w16cex="http://schemas.microsoft.com/office/word/2018/wordml/cex" xmlns:w16cid="http://schemas.microsoft.com/office/word/2016/wordml/cid" xmlns="http://schemas.microsoft.com/office/tasks/2019/documenttasks" xmlns:cr="http://schemas.microsoft.com/office/comments/2020/reactions">
-  <w:p>
-    <w:pPr>
-      <w:keepNext w:val="0"/>
-      <w:keepLines w:val="0"/>
-      <w:pageBreakBefore w:val="0"/>
       <w:widowControl w:val="1"/>
       <w:pBdr>
         <w:top w:space="0" w:sz="0" w:val="nil"/>
@@ -3681,7 +3697,7 @@
             <wp:anchor allowOverlap="1" behindDoc="0" distB="0" distT="0" distL="114300" distR="114300" hidden="0" layoutInCell="1" locked="0" relativeHeight="0" simplePos="0">
               <wp:simplePos x="0" y="0"/>
               <wp:positionH relativeFrom="column">
-                <wp:posOffset>-683894</wp:posOffset>
+                <wp:posOffset>-683893</wp:posOffset>
               </wp:positionH>
               <wp:positionV relativeFrom="paragraph">
                 <wp:posOffset>0</wp:posOffset>
@@ -3689,17 +3705,17 @@
               <wp:extent cx="7753350" cy="190500"/>
               <wp:effectExtent b="0" l="0" r="0" t="0"/>
               <wp:wrapNone/>
-              <wp:docPr id="33" name=""/>
+              <wp:docPr id="37" name=""/>
               <a:graphic>
                 <a:graphicData uri="http://schemas.microsoft.com/office/word/2010/wordprocessingGroup">
                   <wpg:wgp>
                     <wpg:cNvGrpSpPr/>
                     <wpg:grpSpPr>
                       <a:xfrm>
-                        <a:off x="1469325" y="3679975"/>
+                        <a:off x="1469325" y="3684625"/>
                         <a:ext cx="7753350" cy="190500"/>
-                        <a:chOff x="1469325" y="3679975"/>
-                        <a:chExt cx="7753375" cy="195275"/>
+                        <a:chOff x="1469325" y="3684625"/>
+                        <a:chExt cx="7753350" cy="190625"/>
                       </a:xfrm>
                     </wpg:grpSpPr>
                     <wpg:grpSp>
@@ -3708,8 +3724,8 @@
                         <a:xfrm>
                           <a:off x="1469325" y="3684750"/>
                           <a:ext cx="7753350" cy="190500"/>
-                          <a:chOff x="0" y="14970"/>
-                          <a:chExt cx="12255" cy="300"/>
+                          <a:chOff x="1469325" y="3679975"/>
+                          <a:chExt cx="7753375" cy="195275"/>
                         </a:xfrm>
                       </wpg:grpSpPr>
                       <wps:wsp>
@@ -3717,8 +3733,8 @@
                         <wps:cNvPr id="3" name="Shape 3"/>
                         <wps:spPr>
                           <a:xfrm>
-                            <a:off x="0" y="14970"/>
-                            <a:ext cx="12250" cy="300"/>
+                            <a:off x="1469325" y="3679975"/>
+                            <a:ext cx="7753375" cy="195275"/>
                           </a:xfrm>
                           <a:prstGeom prst="rect">
                             <a:avLst/>
@@ -3744,115 +3760,158 @@
                           <a:noAutofit/>
                         </wps:bodyPr>
                       </wps:wsp>
-                      <wps:wsp>
-                        <wps:cNvSpPr/>
-                        <wps:cNvPr id="4" name="Shape 4"/>
-                        <wps:spPr>
-                          <a:xfrm>
-                            <a:off x="10803" y="14982"/>
-                            <a:ext cx="659" cy="288"/>
-                          </a:xfrm>
-                          <a:prstGeom prst="rect">
-                            <a:avLst/>
-                          </a:prstGeom>
-                          <a:noFill/>
-                          <a:ln>
-                            <a:noFill/>
-                          </a:ln>
-                        </wps:spPr>
-                        <wps:txbx>
-                          <w:txbxContent>
-                            <w:p>
-                              <w:pPr>
-                                <w:spacing w:after="160" w:before="0" w:line="258.99999618530273"/>
-                                <w:ind w:left="0" w:right="0" w:firstLine="0"/>
-                                <w:jc w:val="center"/>
-                                <w:textDirection w:val="btLr"/>
-                              </w:pPr>
-                              <w:r>
-                                <w:rPr>
-                                  <w:rFonts w:ascii="Calibri" w:cs="Calibri" w:eastAsia="Calibri" w:hAnsi="Calibri"/>
-                                  <w:b w:val="0"/>
-                                  <w:i w:val="0"/>
-                                  <w:smallCaps w:val="0"/>
-                                  <w:strike w:val="0"/>
-                                  <w:color w:val="8c8c8c"/>
-                                  <w:sz w:val="22"/>
-                                  <w:vertAlign w:val="baseline"/>
-                                </w:rPr>
-                                <w:t xml:space="preserve">0</w:t>
-                              </w:r>
-                            </w:p>
-                          </w:txbxContent>
-                        </wps:txbx>
-                        <wps:bodyPr anchorCtr="0" anchor="t" bIns="0" lIns="0" spcFirstLastPara="1" rIns="0" wrap="square" tIns="0">
-                          <a:noAutofit/>
-                        </wps:bodyPr>
-                      </wps:wsp>
                       <wpg:grpSp>
                         <wpg:cNvGrpSpPr/>
                         <wpg:grpSpPr>
-                          <a:xfrm flipH="1">
-                            <a:off x="0" y="14970"/>
-                            <a:ext cx="12255" cy="230"/>
-                            <a:chOff x="-8" y="14978"/>
-                            <a:chExt cx="12255" cy="230"/>
+                          <a:xfrm>
+                            <a:off x="1469325" y="3684750"/>
+                            <a:ext cx="7753350" cy="190500"/>
+                            <a:chOff x="0" y="14970"/>
+                            <a:chExt cx="12255" cy="300"/>
                           </a:xfrm>
                         </wpg:grpSpPr>
                         <wps:wsp>
-                          <wps:cNvCnPr/>
+                          <wps:cNvSpPr/>
+                          <wps:cNvPr id="5" name="Shape 5"/>
                           <wps:spPr>
-                            <a:xfrm flipH="1" rot="10800000">
-                              <a:off x="-8" y="14978"/>
-                              <a:ext cx="1260" cy="230"/>
+                            <a:xfrm>
+                              <a:off x="0" y="14970"/>
+                              <a:ext cx="12250" cy="300"/>
                             </a:xfrm>
-                            <a:prstGeom prst="bentConnector3">
-                              <a:avLst>
-                                <a:gd fmla="val 923254" name="adj1"/>
-                              </a:avLst>
+                            <a:prstGeom prst="rect">
+                              <a:avLst/>
                             </a:prstGeom>
                             <a:noFill/>
-                            <a:ln cap="flat" cmpd="sng" w="9525">
-                              <a:solidFill>
-                                <a:srgbClr val="A5A5A5"/>
-                              </a:solidFill>
-                              <a:prstDash val="solid"/>
-                              <a:miter lim="8000"/>
-                              <a:headEnd len="med" w="med" type="none"/>
-                              <a:tailEnd len="med" w="med" type="none"/>
+                            <a:ln>
+                              <a:noFill/>
                             </a:ln>
                           </wps:spPr>
+                          <wps:txbx>
+                            <w:txbxContent>
+                              <w:p>
+                                <w:pPr>
+                                  <w:spacing w:after="0" w:before="0" w:line="240"/>
+                                  <w:ind w:left="0" w:right="0" w:firstLine="0"/>
+                                  <w:jc w:val="left"/>
+                                  <w:textDirection w:val="btLr"/>
+                                </w:pPr>
+                              </w:p>
+                            </w:txbxContent>
+                          </wps:txbx>
                           <wps:bodyPr anchorCtr="0" anchor="ctr" bIns="91425" lIns="91425" spcFirstLastPara="1" rIns="91425" wrap="square" tIns="91425">
                             <a:noAutofit/>
                           </wps:bodyPr>
                         </wps:wsp>
                         <wps:wsp>
-                          <wps:cNvCnPr/>
+                          <wps:cNvSpPr/>
+                          <wps:cNvPr id="6" name="Shape 6"/>
                           <wps:spPr>
-                            <a:xfrm rot="10800000">
-                              <a:off x="1252" y="14978"/>
-                              <a:ext cx="10995" cy="230"/>
+                            <a:xfrm>
+                              <a:off x="10803" y="14982"/>
+                              <a:ext cx="659" cy="288"/>
                             </a:xfrm>
-                            <a:prstGeom prst="bentConnector3">
-                              <a:avLst>
-                                <a:gd fmla="val 14609" name="adj1"/>
-                              </a:avLst>
+                            <a:prstGeom prst="rect">
+                              <a:avLst/>
                             </a:prstGeom>
                             <a:noFill/>
-                            <a:ln cap="flat" cmpd="sng" w="9525">
-                              <a:solidFill>
-                                <a:srgbClr val="A5A5A5"/>
-                              </a:solidFill>
-                              <a:prstDash val="solid"/>
-                              <a:miter lim="8000"/>
-                              <a:headEnd len="med" w="med" type="none"/>
-                              <a:tailEnd len="med" w="med" type="none"/>
+                            <a:ln>
+                              <a:noFill/>
                             </a:ln>
                           </wps:spPr>
-                          <wps:bodyPr anchorCtr="0" anchor="ctr" bIns="91425" lIns="91425" spcFirstLastPara="1" rIns="91425" wrap="square" tIns="91425">
+                          <wps:txbx>
+                            <w:txbxContent>
+                              <w:p>
+                                <w:pPr>
+                                  <w:spacing w:after="160" w:before="0" w:line="258.99999618530273"/>
+                                  <w:ind w:left="0" w:right="0" w:firstLine="0"/>
+                                  <w:jc w:val="center"/>
+                                  <w:textDirection w:val="btLr"/>
+                                </w:pPr>
+                                <w:r>
+                                  <w:rPr>
+                                    <w:rFonts w:ascii="Calibri" w:cs="Calibri" w:eastAsia="Calibri" w:hAnsi="Calibri"/>
+                                    <w:b w:val="0"/>
+                                    <w:i w:val="0"/>
+                                    <w:smallCaps w:val="0"/>
+                                    <w:strike w:val="0"/>
+                                    <w:color w:val="8c8c8c"/>
+                                    <w:sz w:val="22"/>
+                                    <w:vertAlign w:val="baseline"/>
+                                  </w:rPr>
+                                  <w:t xml:space="preserve">0</w:t>
+                                </w:r>
+                              </w:p>
+                            </w:txbxContent>
+                          </wps:txbx>
+                          <wps:bodyPr anchorCtr="0" anchor="t" bIns="0" lIns="0" spcFirstLastPara="1" rIns="0" wrap="square" tIns="0">
                             <a:noAutofit/>
                           </wps:bodyPr>
                         </wps:wsp>
+                        <wpg:grpSp>
+                          <wpg:cNvGrpSpPr/>
+                          <wpg:grpSpPr>
+                            <a:xfrm flipH="1">
+                              <a:off x="0" y="14970"/>
+                              <a:ext cx="12255" cy="230"/>
+                              <a:chOff x="-8" y="14978"/>
+                              <a:chExt cx="12255" cy="230"/>
+                            </a:xfrm>
+                          </wpg:grpSpPr>
+                          <wps:wsp>
+                            <wps:cNvCnPr/>
+                            <wps:spPr>
+                              <a:xfrm flipH="1" rot="10800000">
+                                <a:off x="-8" y="14978"/>
+                                <a:ext cx="1260" cy="230"/>
+                              </a:xfrm>
+                              <a:prstGeom prst="bentConnector3">
+                                <a:avLst>
+                                  <a:gd fmla="val 50000" name="adj1"/>
+                                </a:avLst>
+                              </a:prstGeom>
+                              <a:noFill/>
+                              <a:ln cap="flat" cmpd="sng" w="9525">
+                                <a:solidFill>
+                                  <a:srgbClr val="A5A5A5"/>
+                                </a:solidFill>
+                                <a:prstDash val="solid"/>
+                                <a:miter lim="80"/>
+                                <a:headEnd len="sm" w="sm" type="none"/>
+                                <a:tailEnd len="sm" w="sm" type="none"/>
+                              </a:ln>
+                            </wps:spPr>
+                            <wps:bodyPr anchorCtr="0" anchor="ctr" bIns="91425" lIns="91425" spcFirstLastPara="1" rIns="91425" wrap="square" tIns="91425">
+                              <a:noAutofit/>
+                            </wps:bodyPr>
+                          </wps:wsp>
+                          <wps:wsp>
+                            <wps:cNvCnPr/>
+                            <wps:spPr>
+                              <a:xfrm rot="10800000">
+                                <a:off x="1252" y="14978"/>
+                                <a:ext cx="10995" cy="230"/>
+                              </a:xfrm>
+                              <a:prstGeom prst="bentConnector3">
+                                <a:avLst>
+                                  <a:gd fmla="val 96778" name="adj1"/>
+                                </a:avLst>
+                              </a:prstGeom>
+                              <a:noFill/>
+                              <a:ln cap="flat" cmpd="sng" w="9525">
+                                <a:solidFill>
+                                  <a:srgbClr val="A5A5A5"/>
+                                </a:solidFill>
+                                <a:prstDash val="solid"/>
+                                <a:miter lim="80"/>
+                                <a:headEnd len="sm" w="sm" type="none"/>
+                                <a:tailEnd len="sm" w="sm" type="none"/>
+                              </a:ln>
+                            </wps:spPr>
+                            <wps:bodyPr anchorCtr="0" anchor="ctr" bIns="91425" lIns="91425" spcFirstLastPara="1" rIns="91425" wrap="square" tIns="91425">
+                              <a:noAutofit/>
+                            </wps:bodyPr>
+                          </wps:wsp>
+                        </wpg:grpSp>
                       </wpg:grpSp>
                     </wpg:grpSp>
                   </wpg:wgp>
@@ -3866,7 +3925,7 @@
             <wp:anchor allowOverlap="1" behindDoc="0" distB="0" distT="0" distL="114300" distR="114300" hidden="0" layoutInCell="1" locked="0" relativeHeight="0" simplePos="0">
               <wp:simplePos x="0" y="0"/>
               <wp:positionH relativeFrom="column">
-                <wp:posOffset>-683894</wp:posOffset>
+                <wp:posOffset>-683893</wp:posOffset>
               </wp:positionH>
               <wp:positionV relativeFrom="paragraph">
                 <wp:posOffset>0</wp:posOffset>
@@ -3874,7 +3933,7 @@
               <wp:extent cx="7753350" cy="190500"/>
               <wp:effectExtent b="0" l="0" r="0" t="0"/>
               <wp:wrapNone/>
-              <wp:docPr id="33" name="image4.png"/>
+              <wp:docPr id="37" name="image4.png"/>
               <a:graphic>
                 <a:graphicData uri="http://schemas.openxmlformats.org/drawingml/2006/picture">
                   <pic:pic>
@@ -3909,13 +3968,59 @@
 </w:ftr>
 </file>
 
+<file path=word/footer2.xml><?xml version="1.0" encoding="utf-8"?>
+<w:ftr xmlns:mc="http://schemas.openxmlformats.org/markup-compatibility/2006" xmlns:o="urn:schemas-microsoft-com:office:office" xmlns:r="http://schemas.openxmlformats.org/officeDocument/2006/relationships" xmlns:m="http://schemas.openxmlformats.org/officeDocument/2006/math" xmlns:v="urn:schemas-microsoft-com:vml" xmlns:wp="http://schemas.openxmlformats.org/drawingml/2006/wordprocessingDrawing" xmlns:w10="urn:schemas-microsoft-com:office:word" xmlns:w="http://schemas.openxmlformats.org/wordprocessingml/2006/main" xmlns:wne="http://schemas.microsoft.com/office/word/2006/wordml" xmlns:sl="http://schemas.openxmlformats.org/schemaLibrary/2006/main" xmlns:a="http://schemas.openxmlformats.org/drawingml/2006/main" xmlns:pic="http://schemas.openxmlformats.org/drawingml/2006/picture" xmlns:c="http://schemas.openxmlformats.org/drawingml/2006/chart" xmlns:lc="http://schemas.openxmlformats.org/drawingml/2006/lockedCanvas" xmlns:dgm="http://schemas.openxmlformats.org/drawingml/2006/diagram" xmlns:wps="http://schemas.microsoft.com/office/word/2010/wordprocessingShape" xmlns:wpg="http://schemas.microsoft.com/office/word/2010/wordprocessingGroup" xmlns:w14="http://schemas.microsoft.com/office/word/2010/wordml" xmlns:w15="http://schemas.microsoft.com/office/word/2012/wordml" xmlns:w16="http://schemas.microsoft.com/office/word/2018/wordml" xmlns:w16cex="http://schemas.microsoft.com/office/word/2018/wordml/cex" xmlns:w16cid="http://schemas.microsoft.com/office/word/2016/wordml/cid" xmlns="http://schemas.microsoft.com/office/tasks/2019/documenttasks" xmlns:cr="http://schemas.microsoft.com/office/comments/2020/reactions">
+  <w:p>
+    <w:pPr>
+      <w:keepNext w:val="0"/>
+      <w:keepLines w:val="0"/>
+      <w:widowControl w:val="1"/>
+      <w:pBdr>
+        <w:top w:space="0" w:sz="0" w:val="nil"/>
+        <w:left w:space="0" w:sz="0" w:val="nil"/>
+        <w:bottom w:space="0" w:sz="0" w:val="nil"/>
+        <w:right w:space="0" w:sz="0" w:val="nil"/>
+        <w:between w:space="0" w:sz="0" w:val="nil"/>
+      </w:pBdr>
+      <w:shd w:fill="auto" w:val="clear"/>
+      <w:tabs>
+        <w:tab w:val="center" w:leader="none" w:pos="4419"/>
+        <w:tab w:val="right" w:leader="none" w:pos="8838"/>
+      </w:tabs>
+      <w:spacing w:after="0" w:before="0" w:line="240" w:lineRule="auto"/>
+      <w:ind w:left="0" w:right="0" w:firstLine="0"/>
+      <w:jc w:val="left"/>
+      <w:rPr>
+        <w:rFonts w:ascii="Calibri" w:cs="Calibri" w:eastAsia="Calibri" w:hAnsi="Calibri"/>
+        <w:b w:val="0"/>
+        <w:bCs w:val="0"/>
+        <w:i w:val="0"/>
+        <w:iCs w:val="0"/>
+        <w:smallCaps w:val="0"/>
+        <w:strike w:val="0"/>
+        <w:color w:val="000000"/>
+        <w:sz w:val="22"/>
+        <w:szCs w:val="22"/>
+        <w:u w:val="none"/>
+        <w:shd w:fill="auto" w:val="clear"/>
+        <w:vertAlign w:val="baseline"/>
+      </w:rPr>
+    </w:pPr>
+    <w:r>
+      <w:rPr>
+        <w:rtl w:val="0"/>
+      </w:rPr>
+    </w:r>
+  </w:p>
+</w:ftr>
+</file>
+
 <file path=word/footer3.xml><?xml version="1.0" encoding="utf-8"?>
 <w:ftr xmlns:mc="http://schemas.openxmlformats.org/markup-compatibility/2006" xmlns:o="urn:schemas-microsoft-com:office:office" xmlns:r="http://schemas.openxmlformats.org/officeDocument/2006/relationships" xmlns:m="http://schemas.openxmlformats.org/officeDocument/2006/math" xmlns:v="urn:schemas-microsoft-com:vml" xmlns:wp="http://schemas.openxmlformats.org/drawingml/2006/wordprocessingDrawing" xmlns:w10="urn:schemas-microsoft-com:office:word" xmlns:w="http://schemas.openxmlformats.org/wordprocessingml/2006/main" xmlns:wne="http://schemas.microsoft.com/office/word/2006/wordml" xmlns:sl="http://schemas.openxmlformats.org/schemaLibrary/2006/main" xmlns:a="http://schemas.openxmlformats.org/drawingml/2006/main" xmlns:pic="http://schemas.openxmlformats.org/drawingml/2006/picture" xmlns:c="http://schemas.openxmlformats.org/drawingml/2006/chart" xmlns:lc="http://schemas.openxmlformats.org/drawingml/2006/lockedCanvas" xmlns:dgm="http://schemas.openxmlformats.org/drawingml/2006/diagram" xmlns:wps="http://schemas.microsoft.com/office/word/2010/wordprocessingShape" xmlns:wpg="http://schemas.microsoft.com/office/word/2010/wordprocessingGroup" xmlns:w14="http://schemas.microsoft.com/office/word/2010/wordml" xmlns:w15="http://schemas.microsoft.com/office/word/2012/wordml" xmlns:w16="http://schemas.microsoft.com/office/word/2018/wordml" xmlns:w16cex="http://schemas.microsoft.com/office/word/2018/wordml/cex" xmlns:w16cid="http://schemas.microsoft.com/office/word/2016/wordml/cid" xmlns="http://schemas.microsoft.com/office/tasks/2019/documenttasks" xmlns:cr="http://schemas.microsoft.com/office/comments/2020/reactions">
   <w:p>
     <w:pPr>
       <w:keepNext w:val="0"/>
       <w:keepLines w:val="0"/>
-      <w:pageBreakBefore w:val="0"/>
       <w:widowControl w:val="1"/>
       <w:pBdr>
         <w:top w:space="0" w:sz="0" w:val="nil"/>
@@ -3963,55 +4068,6 @@
     <w:pPr>
       <w:keepNext w:val="0"/>
       <w:keepLines w:val="0"/>
-      <w:pageBreakBefore w:val="0"/>
-      <w:widowControl w:val="1"/>
-      <w:pBdr>
-        <w:top w:space="0" w:sz="0" w:val="nil"/>
-        <w:left w:space="0" w:sz="0" w:val="nil"/>
-        <w:bottom w:space="0" w:sz="0" w:val="nil"/>
-        <w:right w:space="0" w:sz="0" w:val="nil"/>
-        <w:between w:space="0" w:sz="0" w:val="nil"/>
-      </w:pBdr>
-      <w:shd w:fill="auto" w:val="clear"/>
-      <w:tabs>
-        <w:tab w:val="center" w:leader="none" w:pos="4419"/>
-        <w:tab w:val="right" w:leader="none" w:pos="8838"/>
-      </w:tabs>
-      <w:spacing w:after="0" w:before="0" w:line="240" w:lineRule="auto"/>
-      <w:ind w:left="0" w:right="0" w:firstLine="0"/>
-      <w:jc w:val="left"/>
-      <w:rPr>
-        <w:rFonts w:ascii="Calibri" w:cs="Calibri" w:eastAsia="Calibri" w:hAnsi="Calibri"/>
-        <w:b w:val="0"/>
-        <w:bCs w:val="0"/>
-        <w:i w:val="0"/>
-        <w:iCs w:val="0"/>
-        <w:smallCaps w:val="0"/>
-        <w:strike w:val="0"/>
-        <w:color w:val="000000"/>
-        <w:sz w:val="22"/>
-        <w:szCs w:val="22"/>
-        <w:u w:val="none"/>
-        <w:shd w:fill="auto" w:val="clear"/>
-        <w:vertAlign w:val="baseline"/>
-      </w:rPr>
-    </w:pPr>
-    <w:r>
-      <w:rPr>
-        <w:rtl w:val="0"/>
-      </w:rPr>
-    </w:r>
-  </w:p>
-</w:hdr>
-</file>
-
-<file path=word/header2.xml><?xml version="1.0" encoding="utf-8"?>
-<w:hdr xmlns:mc="http://schemas.openxmlformats.org/markup-compatibility/2006" xmlns:o="urn:schemas-microsoft-com:office:office" xmlns:r="http://schemas.openxmlformats.org/officeDocument/2006/relationships" xmlns:m="http://schemas.openxmlformats.org/officeDocument/2006/math" xmlns:v="urn:schemas-microsoft-com:vml" xmlns:wp="http://schemas.openxmlformats.org/drawingml/2006/wordprocessingDrawing" xmlns:w10="urn:schemas-microsoft-com:office:word" xmlns:w="http://schemas.openxmlformats.org/wordprocessingml/2006/main" xmlns:wne="http://schemas.microsoft.com/office/word/2006/wordml" xmlns:sl="http://schemas.openxmlformats.org/schemaLibrary/2006/main" xmlns:a="http://schemas.openxmlformats.org/drawingml/2006/main" xmlns:pic="http://schemas.openxmlformats.org/drawingml/2006/picture" xmlns:c="http://schemas.openxmlformats.org/drawingml/2006/chart" xmlns:lc="http://schemas.openxmlformats.org/drawingml/2006/lockedCanvas" xmlns:dgm="http://schemas.openxmlformats.org/drawingml/2006/diagram" xmlns:wps="http://schemas.microsoft.com/office/word/2010/wordprocessingShape" xmlns:wpg="http://schemas.microsoft.com/office/word/2010/wordprocessingGroup" xmlns:w14="http://schemas.microsoft.com/office/word/2010/wordml" xmlns:w15="http://schemas.microsoft.com/office/word/2012/wordml" xmlns:w16="http://schemas.microsoft.com/office/word/2018/wordml" xmlns:w16cex="http://schemas.microsoft.com/office/word/2018/wordml/cex" xmlns:w16cid="http://schemas.microsoft.com/office/word/2016/wordml/cid" xmlns="http://schemas.microsoft.com/office/tasks/2019/documenttasks" xmlns:cr="http://schemas.microsoft.com/office/comments/2020/reactions">
-  <w:p>
-    <w:pPr>
-      <w:keepNext w:val="0"/>
-      <w:keepLines w:val="0"/>
-      <w:pageBreakBefore w:val="0"/>
       <w:widowControl w:val="0"/>
       <w:pBdr>
         <w:top w:space="0" w:sz="0" w:val="nil"/>
@@ -4164,7 +4220,7 @@
               <wp:inline distB="0" distT="0" distL="0" distR="0">
                 <wp:extent cx="1996440" cy="428625"/>
                 <wp:effectExtent b="0" l="0" r="0" t="0"/>
-                <wp:docPr descr="http://www.duoc.cl/normasgraficas/normasgraficas/marca-duoc/6logo-fondo-transparente/fondo-transparente.png" id="34" name="image2.png"/>
+                <wp:docPr descr="http://www.duoc.cl/normasgraficas/normasgraficas/marca-duoc/6logo-fondo-transparente/fondo-transparente.png" id="38" name="image2.png"/>
                 <a:graphic>
                   <a:graphicData uri="http://schemas.openxmlformats.org/drawingml/2006/picture">
                     <pic:pic>
@@ -4206,7 +4262,6 @@
     <w:pPr>
       <w:keepNext w:val="0"/>
       <w:keepLines w:val="0"/>
-      <w:pageBreakBefore w:val="0"/>
       <w:widowControl w:val="1"/>
       <w:pBdr>
         <w:top w:space="0" w:sz="0" w:val="nil"/>
@@ -4248,13 +4303,12 @@
 </w:hdr>
 </file>
 
-<file path=word/header3.xml><?xml version="1.0" encoding="utf-8"?>
+<file path=word/header2.xml><?xml version="1.0" encoding="utf-8"?>
 <w:hdr xmlns:mc="http://schemas.openxmlformats.org/markup-compatibility/2006" xmlns:o="urn:schemas-microsoft-com:office:office" xmlns:r="http://schemas.openxmlformats.org/officeDocument/2006/relationships" xmlns:m="http://schemas.openxmlformats.org/officeDocument/2006/math" xmlns:v="urn:schemas-microsoft-com:vml" xmlns:wp="http://schemas.openxmlformats.org/drawingml/2006/wordprocessingDrawing" xmlns:w10="urn:schemas-microsoft-com:office:word" xmlns:w="http://schemas.openxmlformats.org/wordprocessingml/2006/main" xmlns:wne="http://schemas.microsoft.com/office/word/2006/wordml" xmlns:sl="http://schemas.openxmlformats.org/schemaLibrary/2006/main" xmlns:a="http://schemas.openxmlformats.org/drawingml/2006/main" xmlns:pic="http://schemas.openxmlformats.org/drawingml/2006/picture" xmlns:c="http://schemas.openxmlformats.org/drawingml/2006/chart" xmlns:lc="http://schemas.openxmlformats.org/drawingml/2006/lockedCanvas" xmlns:dgm="http://schemas.openxmlformats.org/drawingml/2006/diagram" xmlns:wps="http://schemas.microsoft.com/office/word/2010/wordprocessingShape" xmlns:wpg="http://schemas.microsoft.com/office/word/2010/wordprocessingGroup" xmlns:w14="http://schemas.microsoft.com/office/word/2010/wordml" xmlns:w15="http://schemas.microsoft.com/office/word/2012/wordml" xmlns:w16="http://schemas.microsoft.com/office/word/2018/wordml" xmlns:w16cex="http://schemas.microsoft.com/office/word/2018/wordml/cex" xmlns:w16cid="http://schemas.microsoft.com/office/word/2016/wordml/cid" xmlns="http://schemas.microsoft.com/office/tasks/2019/documenttasks" xmlns:cr="http://schemas.microsoft.com/office/comments/2020/reactions">
   <w:p>
     <w:pPr>
       <w:keepNext w:val="0"/>
       <w:keepLines w:val="0"/>
-      <w:pageBreakBefore w:val="0"/>
       <w:widowControl w:val="0"/>
       <w:pBdr>
         <w:top w:space="0" w:sz="0" w:val="nil"/>
@@ -4354,12 +4408,12 @@
               <wp:inline distB="0" distT="0" distL="0" distR="0">
                 <wp:extent cx="363448" cy="578253"/>
                 <wp:effectExtent b="0" l="0" r="0" t="0"/>
-                <wp:docPr id="36" name="image1.png"/>
+                <wp:docPr id="40" name="image3.png"/>
                 <a:graphic>
                   <a:graphicData uri="http://schemas.openxmlformats.org/drawingml/2006/picture">
                     <pic:pic>
                       <pic:nvPicPr>
-                        <pic:cNvPr id="0" name="image1.png"/>
+                        <pic:cNvPr id="0" name="image3.png"/>
                         <pic:cNvPicPr preferRelativeResize="0"/>
                       </pic:nvPicPr>
                       <pic:blipFill>
@@ -4510,12 +4564,12 @@
               <wp:inline distB="0" distT="0" distL="0" distR="0">
                 <wp:extent cx="1908834" cy="470407"/>
                 <wp:effectExtent b="0" l="0" r="0" t="0"/>
-                <wp:docPr id="35" name="image3.png"/>
+                <wp:docPr id="39" name="image1.png"/>
                 <a:graphic>
                   <a:graphicData uri="http://schemas.openxmlformats.org/drawingml/2006/picture">
                     <pic:pic>
                       <pic:nvPicPr>
-                        <pic:cNvPr id="0" name="image3.png"/>
+                        <pic:cNvPr id="0" name="image1.png"/>
                         <pic:cNvPicPr preferRelativeResize="0"/>
                       </pic:nvPicPr>
                       <pic:blipFill>
@@ -4552,7 +4606,6 @@
     <w:pPr>
       <w:keepNext w:val="0"/>
       <w:keepLines w:val="0"/>
-      <w:pageBreakBefore w:val="0"/>
       <w:widowControl w:val="1"/>
       <w:pBdr>
         <w:top w:space="0" w:sz="0" w:val="nil"/>
@@ -4569,6 +4622,53 @@
       <w:spacing w:after="0" w:before="0" w:line="240" w:lineRule="auto"/>
       <w:ind w:left="0" w:right="0" w:firstLine="0"/>
       <w:jc w:val="right"/>
+      <w:rPr>
+        <w:rFonts w:ascii="Calibri" w:cs="Calibri" w:eastAsia="Calibri" w:hAnsi="Calibri"/>
+        <w:b w:val="0"/>
+        <w:bCs w:val="0"/>
+        <w:i w:val="0"/>
+        <w:iCs w:val="0"/>
+        <w:smallCaps w:val="0"/>
+        <w:strike w:val="0"/>
+        <w:color w:val="000000"/>
+        <w:sz w:val="22"/>
+        <w:szCs w:val="22"/>
+        <w:u w:val="none"/>
+        <w:shd w:fill="auto" w:val="clear"/>
+        <w:vertAlign w:val="baseline"/>
+      </w:rPr>
+    </w:pPr>
+    <w:r>
+      <w:rPr>
+        <w:rtl w:val="0"/>
+      </w:rPr>
+    </w:r>
+  </w:p>
+</w:hdr>
+</file>
+
+<file path=word/header3.xml><?xml version="1.0" encoding="utf-8"?>
+<w:hdr xmlns:mc="http://schemas.openxmlformats.org/markup-compatibility/2006" xmlns:o="urn:schemas-microsoft-com:office:office" xmlns:r="http://schemas.openxmlformats.org/officeDocument/2006/relationships" xmlns:m="http://schemas.openxmlformats.org/officeDocument/2006/math" xmlns:v="urn:schemas-microsoft-com:vml" xmlns:wp="http://schemas.openxmlformats.org/drawingml/2006/wordprocessingDrawing" xmlns:w10="urn:schemas-microsoft-com:office:word" xmlns:w="http://schemas.openxmlformats.org/wordprocessingml/2006/main" xmlns:wne="http://schemas.microsoft.com/office/word/2006/wordml" xmlns:sl="http://schemas.openxmlformats.org/schemaLibrary/2006/main" xmlns:a="http://schemas.openxmlformats.org/drawingml/2006/main" xmlns:pic="http://schemas.openxmlformats.org/drawingml/2006/picture" xmlns:c="http://schemas.openxmlformats.org/drawingml/2006/chart" xmlns:lc="http://schemas.openxmlformats.org/drawingml/2006/lockedCanvas" xmlns:dgm="http://schemas.openxmlformats.org/drawingml/2006/diagram" xmlns:wps="http://schemas.microsoft.com/office/word/2010/wordprocessingShape" xmlns:wpg="http://schemas.microsoft.com/office/word/2010/wordprocessingGroup" xmlns:w14="http://schemas.microsoft.com/office/word/2010/wordml" xmlns:w15="http://schemas.microsoft.com/office/word/2012/wordml" xmlns:w16="http://schemas.microsoft.com/office/word/2018/wordml" xmlns:w16cex="http://schemas.microsoft.com/office/word/2018/wordml/cex" xmlns:w16cid="http://schemas.microsoft.com/office/word/2016/wordml/cid" xmlns="http://schemas.microsoft.com/office/tasks/2019/documenttasks" xmlns:cr="http://schemas.microsoft.com/office/comments/2020/reactions">
+  <w:p>
+    <w:pPr>
+      <w:keepNext w:val="0"/>
+      <w:keepLines w:val="0"/>
+      <w:widowControl w:val="1"/>
+      <w:pBdr>
+        <w:top w:space="0" w:sz="0" w:val="nil"/>
+        <w:left w:space="0" w:sz="0" w:val="nil"/>
+        <w:bottom w:space="0" w:sz="0" w:val="nil"/>
+        <w:right w:space="0" w:sz="0" w:val="nil"/>
+        <w:between w:space="0" w:sz="0" w:val="nil"/>
+      </w:pBdr>
+      <w:shd w:fill="auto" w:val="clear"/>
+      <w:tabs>
+        <w:tab w:val="center" w:leader="none" w:pos="4419"/>
+        <w:tab w:val="right" w:leader="none" w:pos="8838"/>
+      </w:tabs>
+      <w:spacing w:after="0" w:before="0" w:line="240" w:lineRule="auto"/>
+      <w:ind w:left="0" w:right="0" w:firstLine="0"/>
+      <w:jc w:val="left"/>
       <w:rPr>
         <w:rFonts w:ascii="Calibri" w:cs="Calibri" w:eastAsia="Calibri" w:hAnsi="Calibri"/>
         <w:b w:val="0"/>
@@ -4855,6 +4955,20 @@
       <w:szCs w:val="56"/>
     </w:rPr>
   </w:style>
+  <w:style w:type="table" w:styleId="TableNormal" w:default="1">
+    <w:name w:val="TableNormal"/>
+    <w:tblPr>
+      <w:tblCellMar>
+        <w:top w:w="100.0" w:type="dxa"/>
+        <w:left w:w="100.0" w:type="dxa"/>
+        <w:bottom w:w="100.0" w:type="dxa"/>
+        <w:right w:w="100.0" w:type="dxa"/>
+      </w:tblCellMar>
+    </w:tblPr>
+  </w:style>
+  <w:style w:type="paragraph" w:styleId="Normal" w:default="1">
+    <w:name w:val="normal"/>
+  </w:style>
   <w:style w:type="character" w:styleId="Fuentedeprrafopredeter" w:default="1">
     <w:name w:val="Default Paragraph Font"/>
     <w:uiPriority w:val="1"/>
@@ -5847,6 +5961,125 @@
         <w:shd w:color="auto" w:fill="f2f2f2" w:themeFill="background1" w:themeFillShade="0000F2" w:val="clear"/>
       </w:tcPr>
     </w:tblStylePr>
+  </w:style>
+  <w:style w:type="table" w:styleId="Table1">
+    <w:basedOn w:val="TableNormal"/>
+    <w:pPr>
+      <w:spacing w:after="0" w:line="240" w:lineRule="auto"/>
+    </w:pPr>
+    <w:tblPr>
+      <w:tblStyleRowBandSize w:val="1"/>
+      <w:tblStyleColBandSize w:val="1"/>
+      <w:tblCellMar>
+        <w:top w:w="0.0" w:type="dxa"/>
+        <w:left w:w="108.0" w:type="dxa"/>
+        <w:bottom w:w="0.0" w:type="dxa"/>
+        <w:right w:w="108.0" w:type="dxa"/>
+      </w:tblCellMar>
+    </w:tblPr>
+  </w:style>
+  <w:style w:type="table" w:styleId="Table2">
+    <w:basedOn w:val="TableNormal"/>
+    <w:pPr>
+      <w:spacing w:after="0" w:line="240" w:lineRule="auto"/>
+    </w:pPr>
+    <w:tblPr>
+      <w:tblStyleRowBandSize w:val="1"/>
+      <w:tblStyleColBandSize w:val="1"/>
+      <w:tblCellMar>
+        <w:top w:w="0.0" w:type="dxa"/>
+        <w:left w:w="108.0" w:type="dxa"/>
+        <w:bottom w:w="0.0" w:type="dxa"/>
+        <w:right w:w="108.0" w:type="dxa"/>
+      </w:tblCellMar>
+    </w:tblPr>
+    <w:tblStylePr w:type="band1Horz">
+      <w:tcPr>
+        <w:shd w:fill="f2f2f2" w:val="clear"/>
+      </w:tcPr>
+    </w:tblStylePr>
+    <w:tblStylePr w:type="band1Vert">
+      <w:tcPr>
+        <w:shd w:fill="f2f2f2" w:val="clear"/>
+      </w:tcPr>
+    </w:tblStylePr>
+    <w:tblStylePr w:type="firstCol">
+      <w:rPr>
+        <w:b w:val="1"/>
+        <w:bCs w:val="1"/>
+      </w:rPr>
+    </w:tblStylePr>
+    <w:tblStylePr w:type="firstRow">
+      <w:rPr>
+        <w:b w:val="1"/>
+        <w:bCs w:val="1"/>
+      </w:rPr>
+    </w:tblStylePr>
+    <w:tblStylePr w:type="lastCol">
+      <w:rPr>
+        <w:b w:val="1"/>
+        <w:bCs w:val="1"/>
+      </w:rPr>
+    </w:tblStylePr>
+    <w:tblStylePr w:type="lastRow">
+      <w:rPr>
+        <w:b w:val="1"/>
+        <w:bCs w:val="1"/>
+      </w:rPr>
+      <w:tcPr>
+        <w:tcBorders>
+          <w:top w:color="bfbfbf" w:space="0" w:sz="4" w:val="single"/>
+        </w:tcBorders>
+      </w:tcPr>
+    </w:tblStylePr>
+  </w:style>
+  <w:style w:type="table" w:styleId="Table3">
+    <w:basedOn w:val="TableNormal"/>
+    <w:pPr>
+      <w:spacing w:after="0" w:line="240" w:lineRule="auto"/>
+    </w:pPr>
+    <w:tblPr>
+      <w:tblStyleRowBandSize w:val="1"/>
+      <w:tblStyleColBandSize w:val="1"/>
+      <w:tblCellMar>
+        <w:top w:w="0.0" w:type="dxa"/>
+        <w:left w:w="108.0" w:type="dxa"/>
+        <w:bottom w:w="0.0" w:type="dxa"/>
+        <w:right w:w="108.0" w:type="dxa"/>
+      </w:tblCellMar>
+    </w:tblPr>
+  </w:style>
+  <w:style w:type="table" w:styleId="Table4">
+    <w:basedOn w:val="TableNormal"/>
+    <w:pPr>
+      <w:spacing w:after="0" w:line="240" w:lineRule="auto"/>
+    </w:pPr>
+    <w:tblPr>
+      <w:tblStyleRowBandSize w:val="1"/>
+      <w:tblStyleColBandSize w:val="1"/>
+      <w:tblCellMar>
+        <w:top w:w="0.0" w:type="dxa"/>
+        <w:left w:w="108.0" w:type="dxa"/>
+        <w:bottom w:w="0.0" w:type="dxa"/>
+        <w:right w:w="108.0" w:type="dxa"/>
+      </w:tblCellMar>
+    </w:tblPr>
+  </w:style>
+  <w:style w:type="table" w:styleId="Table5">
+    <w:basedOn w:val="TableNormal"/>
+    <w:pPr>
+      <w:spacing w:after="0" w:line="240" w:lineRule="auto"/>
+    </w:pPr>
+    <w:tblPr>
+      <w:tblStyleRowBandSize w:val="1"/>
+      <w:tblStyleColBandSize w:val="1"/>
+      <w:tblCellMar>
+        <w:top w:w="0.0" w:type="dxa"/>
+        <w:left w:w="108.0" w:type="dxa"/>
+        <w:bottom w:w="0.0" w:type="dxa"/>
+        <w:right w:w="108.0" w:type="dxa"/>
+      </w:tblCellMar>
+    </w:tblPr>
   </w:style>
   <w:style w:type="paragraph" w:styleId="Subtitle">
     <w:name w:val="Subtitle"/>
@@ -6249,7 +6482,7 @@
 
 <file path=customXML/item1.xml><?xml version="1.0" encoding="utf-8"?>
 <go:gDocsCustomXmlDataStorage xmlns:go="http://customooxmlschemas.google.com/" xmlns:r="http://schemas.openxmlformats.org/officeDocument/2006/relationships" uri="GoogleDocsCustomDataVersion2">
-  <go:docsCustomData xmlns:go="http://customooxmlschemas.google.com/" roundtripDataSignature="AMtx7mgV9QZN+drgLf46O7jEpaEXdY3Xvw==">CgMxLjAyDmgubW82YWc1eXRsMnZ2Mg5oLm10aWRnb3ozYnViNDgAciExZGdQbW12MC1QYk9ib2tsYmZiTVh6ODhwaEJoTEEtYkI=</go:docsCustomData>
+  <go:docsCustomData xmlns:go="http://customooxmlschemas.google.com/" roundtripDataSignature="AMtx7mjPnmMOECWMsatG32VzhfRrpxt1IQ==">CgMxLjAyDmgubW82YWc1eXRsMnZ2Mg5oLm10aWRnb3ozYnViNDgAciExckUzRnd0OWJoSnZNZ09lQUlEXzlhVzRMSGs2cEVUN1E=</go:docsCustomData>
 </go:gDocsCustomXmlDataStorage>
 </file>
 

</xml_diff>